<commit_message>
New udpdate banc de test
</commit_message>
<xml_diff>
--- a/Datasheet/Datasheet_graphite_sensor.docx
+++ b/Datasheet/Datasheet_graphite_sensor.docx
@@ -393,7 +393,7 @@
           <w:lang w:val="en-US"/>
         </w:rPr>
         <w:drawing>
-          <wp:anchor distT="0" distB="0" distL="114300" distR="114300" simplePos="0" relativeHeight="251659264" behindDoc="1" locked="0" layoutInCell="1" allowOverlap="1" wp14:anchorId="2C8EC3C5" wp14:editId="772D0028">
+          <wp:anchor distT="0" distB="0" distL="114300" distR="114300" simplePos="0" relativeHeight="251659264" behindDoc="1" locked="0" layoutInCell="1" allowOverlap="1" wp14:anchorId="2C8EC3C5" wp14:editId="45B5D91F">
             <wp:simplePos x="0" y="0"/>
             <wp:positionH relativeFrom="margin">
               <wp:align>right</wp:align>
@@ -856,7 +856,7 @@
           <w:lang w:val="en-US"/>
         </w:rPr>
         <w:drawing>
-          <wp:anchor distT="0" distB="0" distL="114300" distR="114300" simplePos="0" relativeHeight="251660288" behindDoc="1" locked="0" layoutInCell="1" allowOverlap="1" wp14:anchorId="54347F22" wp14:editId="4D6357D2">
+          <wp:anchor distT="0" distB="0" distL="114300" distR="114300" simplePos="0" relativeHeight="251660288" behindDoc="1" locked="0" layoutInCell="1" allowOverlap="1" wp14:anchorId="54347F22" wp14:editId="43FFC1AD">
             <wp:simplePos x="0" y="0"/>
             <wp:positionH relativeFrom="margin">
               <wp:align>right</wp:align>
@@ -3750,43 +3750,29 @@
     <w:p>
       <w:pPr>
         <w:spacing w:line="276" w:lineRule="auto"/>
-        <w:jc w:val="both"/>
-        <w:rPr>
-          <w:rFonts w:ascii="Times New Roman" w:hAnsi="Times New Roman" w:cs="Times New Roman"/>
-          <w:b/>
-          <w:bCs/>
+        <w:jc w:val="center"/>
+        <w:rPr>
+          <w:rFonts w:ascii="Times New Roman" w:hAnsi="Times New Roman" w:cs="Times New Roman"/>
+          <w:noProof/>
           <w:sz w:val="24"/>
           <w:szCs w:val="24"/>
           <w:lang w:val="en-US"/>
         </w:rPr>
       </w:pPr>
-    </w:p>
-    <w:p>
-      <w:pPr>
-        <w:spacing w:line="276" w:lineRule="auto"/>
-        <w:jc w:val="center"/>
+      <w:r>
         <w:rPr>
           <w:rFonts w:ascii="Times New Roman" w:hAnsi="Times New Roman" w:cs="Times New Roman"/>
           <w:noProof/>
           <w:sz w:val="24"/>
           <w:szCs w:val="24"/>
           <w:lang w:val="en-US"/>
-        </w:rPr>
-      </w:pPr>
-      <w:r>
-        <w:rPr>
-          <w:rFonts w:ascii="Times New Roman" w:hAnsi="Times New Roman" w:cs="Times New Roman"/>
-          <w:noProof/>
-          <w:sz w:val="24"/>
-          <w:szCs w:val="24"/>
-          <w:lang w:val="en-US"/>
           <w14:ligatures w14:val="standardContextual"/>
         </w:rPr>
         <w:drawing>
-          <wp:inline distT="0" distB="0" distL="0" distR="0" wp14:anchorId="71E3636E" wp14:editId="2BF38E5D">
-            <wp:extent cx="4344761" cy="2819400"/>
+          <wp:inline distT="0" distB="0" distL="0" distR="0" wp14:anchorId="07020D28" wp14:editId="52CBB49E">
+            <wp:extent cx="4423841" cy="3056021"/>
             <wp:effectExtent l="0" t="0" r="0" b="0"/>
-            <wp:docPr id="1899129703" name="Image 5"/>
+            <wp:docPr id="1287584581" name="Image 5"/>
             <wp:cNvGraphicFramePr>
               <a:graphicFrameLocks xmlns:a="http://schemas.openxmlformats.org/drawingml/2006/main" noChangeAspect="1"/>
             </wp:cNvGraphicFramePr>
@@ -3794,7 +3780,7 @@
               <a:graphicData uri="http://schemas.openxmlformats.org/drawingml/2006/picture">
                 <pic:pic xmlns:pic="http://schemas.openxmlformats.org/drawingml/2006/picture">
                   <pic:nvPicPr>
-                    <pic:cNvPr id="1899129703" name="Image 1899129703"/>
+                    <pic:cNvPr id="1287584581" name="Image 1287584581"/>
                     <pic:cNvPicPr/>
                   </pic:nvPicPr>
                   <pic:blipFill>
@@ -3812,7 +3798,7 @@
                   <pic:spPr>
                     <a:xfrm>
                       <a:off x="0" y="0"/>
-                      <a:ext cx="4372941" cy="2837686"/>
+                      <a:ext cx="4457616" cy="3079353"/>
                     </a:xfrm>
                     <a:prstGeom prst="rect">
                       <a:avLst/>
@@ -3859,10 +3845,10 @@
         </w:rPr>
         <w:lastRenderedPageBreak/>
         <w:drawing>
-          <wp:inline distT="0" distB="0" distL="0" distR="0" wp14:anchorId="004ED004" wp14:editId="67B63430">
-            <wp:extent cx="4871357" cy="3457301"/>
-            <wp:effectExtent l="0" t="0" r="5715" b="0"/>
-            <wp:docPr id="1639120391" name="Image 6"/>
+          <wp:inline distT="0" distB="0" distL="0" distR="0" wp14:anchorId="2ECD11F3" wp14:editId="745CAD5B">
+            <wp:extent cx="5760720" cy="3486150"/>
+            <wp:effectExtent l="0" t="0" r="0" b="0"/>
+            <wp:docPr id="2069018195" name="Image 6"/>
             <wp:cNvGraphicFramePr>
               <a:graphicFrameLocks xmlns:a="http://schemas.openxmlformats.org/drawingml/2006/main" noChangeAspect="1"/>
             </wp:cNvGraphicFramePr>
@@ -3870,7 +3856,7 @@
               <a:graphicData uri="http://schemas.openxmlformats.org/drawingml/2006/picture">
                 <pic:pic xmlns:pic="http://schemas.openxmlformats.org/drawingml/2006/picture">
                   <pic:nvPicPr>
-                    <pic:cNvPr id="1639120391" name="Image 1639120391"/>
+                    <pic:cNvPr id="2069018195" name="Image 2069018195"/>
                     <pic:cNvPicPr/>
                   </pic:nvPicPr>
                   <pic:blipFill>
@@ -3888,7 +3874,7 @@
                   <pic:spPr>
                     <a:xfrm>
                       <a:off x="0" y="0"/>
-                      <a:ext cx="4881879" cy="3464769"/>
+                      <a:ext cx="5760720" cy="3486150"/>
                     </a:xfrm>
                     <a:prstGeom prst="rect">
                       <a:avLst/>
@@ -5857,7 +5843,7 @@
           <w:bdr w:val="none" w:sz="0" w:space="0" w:color="auto" w:frame="1"/>
         </w:rPr>
         <w:drawing>
-          <wp:inline distT="0" distB="0" distL="0" distR="0" wp14:anchorId="050C168E" wp14:editId="4E9BE314">
+          <wp:inline distT="0" distB="0" distL="0" distR="0" wp14:anchorId="050C168E" wp14:editId="22737FEF">
             <wp:extent cx="5734050" cy="1332865"/>
             <wp:effectExtent l="0" t="0" r="0" b="635"/>
             <wp:docPr id="1705066560" name="Picture 2"/>

</xml_diff>